<commit_message>
docs: finalize course deliverables and team contributions
</commit_message>
<xml_diff>
--- a/deliverables/course/ChainGrade_项目介绍.docx
+++ b/deliverables/course/ChainGrade_项目介绍.docx
@@ -427,7 +427,7 @@
                 <w:color w:val="14231D"/>
                 <w:sz w:val="18"/>
               </w:rPr>
-              <w:t>2026 年 8 月 28 日</w:t>
+              <w:t>2026 年 9 月 7 日</w:t>
             </w:r>
           </w:p>
         </w:tc>
@@ -539,7 +539,7 @@
           <w:color w:val="14231D"/>
           <w:sz w:val="22"/>
         </w:rPr>
-        <w:t>最终系统采用浏览器/服务器结构。教师可以单条录入或按教学班导入 CSV，院系复核员使用独立身份批准、驳回和撤销，学生只能查看自己的私有成绩并发起申诉，外部验证者通过公开页面或二维码核对当前状态与详情承诺。</w:t>
+        <w:t>最终系统采用浏览器/服务器结构。教师可以单条录入或按教学班导入 CSV，院系复核员使用独立身份批准、驳回和撤销，学生只能查看自己的私有成绩并发起申诉，外部验证者通过公开页面、二维码或标准 VC 文件核对签名、当前状态与详情承诺。</w:t>
       </w:r>
     </w:p>
     <w:tbl>
@@ -675,19 +675,11 @@
             <w:tcW w:type="dxa" w:w="2100"/>
           </w:tcPr>
           <w:p>
-            <w:pPr>
-              <w:spacing w:before="0" w:after="0" w:line="276" w:lineRule="auto"/>
-              <w:jc w:val="center"/>
-            </w:pPr>
             <w:r>
               <w:rPr>
                 <w:rFonts w:ascii="Microsoft YaHei" w:hAnsi="Microsoft YaHei" w:eastAsia="Microsoft YaHei"/>
-                <w:b w:val="0"/>
-                <w:i w:val="0"/>
-                <w:color w:val="14231D"/>
-                <w:sz w:val="18"/>
               </w:rPr>
-              <w:t>52 / 52</w:t>
+              <w:t>120 / 120 + 7 / 7</w:t>
             </w:r>
           </w:p>
         </w:tc>
@@ -696,19 +688,11 @@
             <w:tcW w:type="dxa" w:w="5160"/>
           </w:tcPr>
           <w:p>
-            <w:pPr>
-              <w:spacing w:before="0" w:after="0" w:line="276" w:lineRule="auto"/>
-              <w:jc w:val="left"/>
-            </w:pPr>
             <w:r>
               <w:rPr>
                 <w:rFonts w:ascii="Microsoft YaHei" w:hAnsi="Microsoft YaHei" w:eastAsia="Microsoft YaHei"/>
-                <w:b w:val="0"/>
-                <w:i w:val="0"/>
-                <w:color w:val="14231D"/>
-                <w:sz w:val="18"/>
               </w:rPr>
-              <w:t>shared 6、chaincode 20、API 26</w:t>
+              <w:t>项目测试 shared 33、chaincode 20、API 67；基准工具 7</w:t>
             </w:r>
           </w:p>
         </w:tc>
@@ -1043,6 +1027,88 @@
                 <w:sz w:val="18"/>
               </w:rPr>
               <w:t>无横向溢出，console 0 warning/error</w:t>
+            </w:r>
+          </w:p>
+        </w:tc>
+      </w:tr>
+      <w:tr>
+        <w:tc>
+          <w:tcPr>
+            <w:tcW w:type="dxa" w:w="2100"/>
+          </w:tcPr>
+          <w:p>
+            <w:r>
+              <w:rPr>
+                <w:rFonts w:ascii="Microsoft YaHei" w:hAnsi="Microsoft YaHei" w:eastAsia="Microsoft YaHei"/>
+              </w:rPr>
+              <w:t>性能矩阵</w:t>
+            </w:r>
+          </w:p>
+        </w:tc>
+        <w:tc>
+          <w:tcPr>
+            <w:tcW w:type="dxa" w:w="2100"/>
+          </w:tcPr>
+          <w:p>
+            <w:r>
+              <w:rPr>
+                <w:rFonts w:ascii="Microsoft YaHei" w:hAnsi="Microsoft YaHei" w:eastAsia="Microsoft YaHei"/>
+              </w:rPr>
+              <w:t>84 个正式单元</w:t>
+            </w:r>
+          </w:p>
+        </w:tc>
+        <w:tc>
+          <w:tcPr>
+            <w:tcW w:type="dxa" w:w="5160"/>
+          </w:tcPr>
+          <w:p>
+            <w:r>
+              <w:rPr>
+                <w:rFonts w:ascii="Microsoft YaHei" w:hAnsi="Microsoft YaHei" w:eastAsia="Microsoft YaHei"/>
+              </w:rPr>
+              <w:t>7 类负载 × 4 档并发 × 3 次，合法请求失败率 0</w:t>
+            </w:r>
+          </w:p>
+        </w:tc>
+      </w:tr>
+      <w:tr>
+        <w:tc>
+          <w:tcPr>
+            <w:tcW w:type="dxa" w:w="2100"/>
+          </w:tcPr>
+          <w:p>
+            <w:r>
+              <w:rPr>
+                <w:rFonts w:ascii="Microsoft YaHei" w:hAnsi="Microsoft YaHei" w:eastAsia="Microsoft YaHei"/>
+              </w:rPr>
+              <w:t>VC 互操作</w:t>
+            </w:r>
+          </w:p>
+        </w:tc>
+        <w:tc>
+          <w:tcPr>
+            <w:tcW w:type="dxa" w:w="2100"/>
+          </w:tcPr>
+          <w:p>
+            <w:r>
+              <w:rPr>
+                <w:rFonts w:ascii="Microsoft YaHei" w:hAnsi="Microsoft YaHei" w:eastAsia="Microsoft YaHei"/>
+              </w:rPr>
+              <w:t>4 视口 / 5 类负向验收</w:t>
+            </w:r>
+          </w:p>
+        </w:tc>
+        <w:tc>
+          <w:tcPr>
+            <w:tcW w:type="dxa" w:w="5160"/>
+          </w:tcPr>
+          <w:p>
+            <w:r>
+              <w:rPr>
+                <w:rFonts w:ascii="Microsoft YaHei" w:hAnsi="Microsoft YaHei" w:eastAsia="Microsoft YaHei"/>
+              </w:rPr>
+              <w:t>Ed25519 签名、链上状态、详情锚定分段验证</w:t>
             </w:r>
           </w:p>
         </w:tc>
@@ -2746,7 +2812,7 @@
         <w:keepNext/>
       </w:pPr>
       <w:r>
-        <w:t>5.3 六类已实现功能</w:t>
+        <w:t>5.3 七类已实现功能</w:t>
       </w:r>
     </w:p>
     <w:tbl>
@@ -3250,6 +3316,47 @@
                 <w:sz w:val="18"/>
               </w:rPr>
               <w:t>错误验证者 403，超次 409</w:t>
+            </w:r>
+          </w:p>
+        </w:tc>
+      </w:tr>
+      <w:tr>
+        <w:tc>
+          <w:tcPr>
+            <w:tcW w:type="dxa" w:w="1900"/>
+          </w:tcPr>
+          <w:p>
+            <w:r>
+              <w:rPr>
+                <w:rFonts w:ascii="Microsoft YaHei" w:hAnsi="Microsoft YaHei" w:eastAsia="Microsoft YaHei"/>
+              </w:rPr>
+              <w:t>标准 VC 文件</w:t>
+            </w:r>
+          </w:p>
+        </w:tc>
+        <w:tc>
+          <w:tcPr>
+            <w:tcW w:type="dxa" w:w="3600"/>
+          </w:tcPr>
+          <w:p>
+            <w:r>
+              <w:rPr>
+                <w:rFonts w:ascii="Microsoft YaHei" w:hAnsi="Microsoft YaHei" w:eastAsia="Microsoft YaHei"/>
+              </w:rPr>
+              <w:t>Ed25519 签名 + JSON 导出/上传</w:t>
+            </w:r>
+          </w:p>
+        </w:tc>
+        <w:tc>
+          <w:tcPr>
+            <w:tcW w:type="dxa" w:w="3860"/>
+          </w:tcPr>
+          <w:p>
+            <w:r>
+              <w:rPr>
+                <w:rFonts w:ascii="Microsoft YaHei" w:hAnsi="Microsoft YaHei" w:eastAsia="Microsoft YaHei"/>
+              </w:rPr>
+              <w:t>签名、链上状态、详情锚定三段验证；篡改失败</w:t>
             </w:r>
           </w:p>
         </w:tc>
@@ -5117,19 +5224,11 @@
             <w:tcW w:type="dxa" w:w="1880"/>
           </w:tcPr>
           <w:p>
-            <w:pPr>
-              <w:spacing w:before="0" w:after="0" w:line="276" w:lineRule="auto"/>
-              <w:jc w:val="center"/>
-            </w:pPr>
             <w:r>
               <w:rPr>
                 <w:rFonts w:ascii="Microsoft YaHei" w:hAnsi="Microsoft YaHei" w:eastAsia="Microsoft YaHei"/>
-                <w:b w:val="0"/>
-                <w:i w:val="0"/>
-                <w:color w:val="14231D"/>
-                <w:sz w:val="18"/>
               </w:rPr>
-              <w:t>6</w:t>
+              <w:t>33</w:t>
             </w:r>
           </w:p>
         </w:tc>
@@ -5138,17 +5237,9 @@
             <w:tcW w:type="dxa" w:w="1880"/>
           </w:tcPr>
           <w:p>
-            <w:pPr>
-              <w:spacing w:before="0" w:after="0" w:line="276" w:lineRule="auto"/>
-              <w:jc w:val="center"/>
-            </w:pPr>
             <w:r>
               <w:rPr>
                 <w:rFonts w:ascii="Microsoft YaHei" w:hAnsi="Microsoft YaHei" w:eastAsia="Microsoft YaHei"/>
-                <w:b w:val="0"/>
-                <w:i w:val="0"/>
-                <w:color w:val="14231D"/>
-                <w:sz w:val="18"/>
               </w:rPr>
               <w:t>0</w:t>
             </w:r>
@@ -5184,17 +5275,9 @@
             <w:shd w:fill="F3F6F2"/>
           </w:tcPr>
           <w:p>
-            <w:pPr>
-              <w:spacing w:before="0" w:after="0" w:line="276" w:lineRule="auto"/>
-              <w:jc w:val="center"/>
-            </w:pPr>
             <w:r>
               <w:rPr>
                 <w:rFonts w:ascii="Microsoft YaHei" w:hAnsi="Microsoft YaHei" w:eastAsia="Microsoft YaHei"/>
-                <w:b w:val="0"/>
-                <w:i w:val="0"/>
-                <w:color w:val="14231D"/>
-                <w:sz w:val="18"/>
               </w:rPr>
               <w:t>20</w:t>
             </w:r>
@@ -5206,17 +5289,9 @@
             <w:shd w:fill="F3F6F2"/>
           </w:tcPr>
           <w:p>
-            <w:pPr>
-              <w:spacing w:before="0" w:after="0" w:line="276" w:lineRule="auto"/>
-              <w:jc w:val="center"/>
-            </w:pPr>
             <w:r>
               <w:rPr>
                 <w:rFonts w:ascii="Microsoft YaHei" w:hAnsi="Microsoft YaHei" w:eastAsia="Microsoft YaHei"/>
-                <w:b w:val="0"/>
-                <w:i w:val="0"/>
-                <w:color w:val="14231D"/>
-                <w:sz w:val="18"/>
               </w:rPr>
               <w:t>0</w:t>
             </w:r>
@@ -5250,19 +5325,11 @@
             <w:tcW w:type="dxa" w:w="1880"/>
           </w:tcPr>
           <w:p>
-            <w:pPr>
-              <w:spacing w:before="0" w:after="0" w:line="276" w:lineRule="auto"/>
-              <w:jc w:val="center"/>
-            </w:pPr>
             <w:r>
               <w:rPr>
                 <w:rFonts w:ascii="Microsoft YaHei" w:hAnsi="Microsoft YaHei" w:eastAsia="Microsoft YaHei"/>
-                <w:b w:val="0"/>
-                <w:i w:val="0"/>
-                <w:color w:val="14231D"/>
-                <w:sz w:val="18"/>
               </w:rPr>
-              <w:t>26</w:t>
+              <w:t>67</w:t>
             </w:r>
           </w:p>
         </w:tc>
@@ -5271,17 +5338,9 @@
             <w:tcW w:type="dxa" w:w="1880"/>
           </w:tcPr>
           <w:p>
-            <w:pPr>
-              <w:spacing w:before="0" w:after="0" w:line="276" w:lineRule="auto"/>
-              <w:jc w:val="center"/>
-            </w:pPr>
             <w:r>
               <w:rPr>
                 <w:rFonts w:ascii="Microsoft YaHei" w:hAnsi="Microsoft YaHei" w:eastAsia="Microsoft YaHei"/>
-                <w:b w:val="0"/>
-                <w:i w:val="0"/>
-                <w:color w:val="14231D"/>
-                <w:sz w:val="18"/>
               </w:rPr>
               <w:t>0</w:t>
             </w:r>
@@ -5317,19 +5376,11 @@
             <w:shd w:fill="F3F6F2"/>
           </w:tcPr>
           <w:p>
-            <w:pPr>
-              <w:spacing w:before="0" w:after="0" w:line="276" w:lineRule="auto"/>
-              <w:jc w:val="center"/>
-            </w:pPr>
             <w:r>
               <w:rPr>
                 <w:rFonts w:ascii="Microsoft YaHei" w:hAnsi="Microsoft YaHei" w:eastAsia="Microsoft YaHei"/>
-                <w:b w:val="0"/>
-                <w:i w:val="0"/>
-                <w:color w:val="14231D"/>
-                <w:sz w:val="18"/>
               </w:rPr>
-              <w:t>52</w:t>
+              <w:t>120</w:t>
             </w:r>
           </w:p>
         </w:tc>
@@ -5339,17 +5390,50 @@
             <w:shd w:fill="F3F6F2"/>
           </w:tcPr>
           <w:p>
-            <w:pPr>
-              <w:spacing w:before="0" w:after="0" w:line="276" w:lineRule="auto"/>
-              <w:jc w:val="center"/>
-            </w:pPr>
             <w:r>
               <w:rPr>
                 <w:rFonts w:ascii="Microsoft YaHei" w:hAnsi="Microsoft YaHei" w:eastAsia="Microsoft YaHei"/>
-                <w:b w:val="0"/>
-                <w:i w:val="0"/>
-                <w:color w:val="14231D"/>
-                <w:sz w:val="18"/>
+              </w:rPr>
+              <w:t>0</w:t>
+            </w:r>
+          </w:p>
+        </w:tc>
+      </w:tr>
+      <w:tr>
+        <w:tc>
+          <w:tcPr>
+            <w:tcW w:type="dxa" w:w="5600"/>
+          </w:tcPr>
+          <w:p>
+            <w:r>
+              <w:rPr>
+                <w:rFonts w:ascii="Microsoft YaHei" w:hAnsi="Microsoft YaHei" w:eastAsia="Microsoft YaHei"/>
+              </w:rPr>
+              <w:t>基准工具（独立）</w:t>
+            </w:r>
+          </w:p>
+        </w:tc>
+        <w:tc>
+          <w:tcPr>
+            <w:tcW w:type="dxa" w:w="1880"/>
+          </w:tcPr>
+          <w:p>
+            <w:r>
+              <w:rPr>
+                <w:rFonts w:ascii="Microsoft YaHei" w:hAnsi="Microsoft YaHei" w:eastAsia="Microsoft YaHei"/>
+              </w:rPr>
+              <w:t>7</w:t>
+            </w:r>
+          </w:p>
+        </w:tc>
+        <w:tc>
+          <w:tcPr>
+            <w:tcW w:type="dxa" w:w="1880"/>
+          </w:tcPr>
+          <w:p>
+            <w:r>
+              <w:rPr>
+                <w:rFonts w:ascii="Microsoft YaHei" w:hAnsi="Microsoft YaHei" w:eastAsia="Microsoft YaHei"/>
               </w:rPr>
               <w:t>0</w:t>
             </w:r>
@@ -5376,6 +5460,9 @@
           <w:sz w:val="22"/>
         </w:rPr>
         <w:t>链码语句覆盖率 85.91%，分支 75.38%，函数 95.52%，行 85.98%。分支覆盖率低于其他指标，说明分页和部分底层 Fabric 异常组合仍有补测空间；报告保留这一差距，没有只展示最高覆盖率。</w:t>
+      </w:r>
+      <w:r>
+        <w:t xml:space="preserve"> 标准 VC 验收覆盖 4 种视口与篡改、解析失败、超限、撤销/取代和锚定不一致等负向状态。隔离性能矩阵在并发 20 时测得公开验证吞吐中位数 746.614 次/秒、P95 38.202 ms；单 orderer 的稳定恢复为 22.482 秒，因此系统可恢复但不具备写入高可用。</w:t>
       </w:r>
     </w:p>
     <w:p>
@@ -5674,19 +5761,11 @@
             <w:tcW w:type="dxa" w:w="3560"/>
           </w:tcPr>
           <w:p>
-            <w:pPr>
-              <w:spacing w:before="0" w:after="0" w:line="276" w:lineRule="auto"/>
-              <w:jc w:val="left"/>
-            </w:pPr>
             <w:r>
               <w:rPr>
                 <w:rFonts w:ascii="Microsoft YaHei" w:hAnsi="Microsoft YaHei" w:eastAsia="Microsoft YaHei"/>
-                <w:b w:val="0"/>
-                <w:i w:val="0"/>
-                <w:color w:val="14231D"/>
-                <w:sz w:val="18"/>
               </w:rPr>
-              <w:t>架构、Fabric、链码、部署与集成</w:t>
+              <w:t>基础系统、Fabric、部署、材料与集成</w:t>
             </w:r>
           </w:p>
         </w:tc>
@@ -5695,19 +5774,11 @@
             <w:tcW w:type="dxa" w:w="4100"/>
           </w:tcPr>
           <w:p>
-            <w:pPr>
-              <w:spacing w:before="0" w:after="0" w:line="276" w:lineRule="auto"/>
-              <w:jc w:val="left"/>
-            </w:pPr>
             <w:r>
               <w:rPr>
                 <w:rFonts w:ascii="Microsoft YaHei" w:hAnsi="Microsoft YaHei" w:eastAsia="Microsoft YaHei"/>
-                <w:b w:val="0"/>
-                <w:i w:val="0"/>
-                <w:color w:val="14231D"/>
-                <w:sz w:val="18"/>
               </w:rPr>
-              <w:t>设计记录、链码与网络、备份恢复</w:t>
+              <w:t>主干设计实现、恢复与 UI 验收、PR 评审修复与合并；4 分</w:t>
             </w:r>
           </w:p>
         </w:tc>
@@ -5741,19 +5812,11 @@
             <w:shd w:fill="F3F6F2"/>
           </w:tcPr>
           <w:p>
-            <w:pPr>
-              <w:spacing w:before="0" w:after="0" w:line="276" w:lineRule="auto"/>
-              <w:jc w:val="left"/>
-            </w:pPr>
             <w:r>
               <w:rPr>
                 <w:rFonts w:ascii="Microsoft YaHei" w:hAnsi="Microsoft YaHei" w:eastAsia="Microsoft YaHei"/>
-                <w:b w:val="0"/>
-                <w:i w:val="0"/>
-                <w:color w:val="14231D"/>
-                <w:sz w:val="18"/>
               </w:rPr>
-              <w:t>Web、视觉、二维码与浏览器验收</w:t>
+              <w:t>标准 VC 互操作与验证体验</w:t>
             </w:r>
           </w:p>
         </w:tc>
@@ -5763,19 +5826,11 @@
             <w:shd w:fill="F3F6F2"/>
           </w:tcPr>
           <w:p>
-            <w:pPr>
-              <w:spacing w:before="0" w:after="0" w:line="276" w:lineRule="auto"/>
-              <w:jc w:val="left"/>
-            </w:pPr>
             <w:r>
               <w:rPr>
                 <w:rFonts w:ascii="Microsoft YaHei" w:hAnsi="Microsoft YaHei" w:eastAsia="Microsoft YaHei"/>
-                <w:b w:val="0"/>
-                <w:i w:val="0"/>
-                <w:color w:val="14231D"/>
-                <w:sz w:val="18"/>
               </w:rPr>
-              <w:t>四角色 UI、响应式截图、交互状态</w:t>
+              <w:t>PR #2、VC 签发验证、导出/上传、负向测试与四视口截图；3 分</w:t>
             </w:r>
           </w:p>
         </w:tc>
@@ -5807,19 +5862,11 @@
             <w:tcW w:type="dxa" w:w="3560"/>
           </w:tcPr>
           <w:p>
-            <w:pPr>
-              <w:spacing w:before="0" w:after="0" w:line="276" w:lineRule="auto"/>
-              <w:jc w:val="left"/>
-            </w:pPr>
             <w:r>
               <w:rPr>
                 <w:rFonts w:ascii="Microsoft YaHei" w:hAnsi="Microsoft YaHei" w:eastAsia="Microsoft YaHei"/>
-                <w:b w:val="0"/>
-                <w:i w:val="0"/>
-                <w:color w:val="14231D"/>
-                <w:sz w:val="18"/>
               </w:rPr>
-              <w:t>API、Gateway、认证和自动测试</w:t>
+              <w:t>性能基准与故障证据</w:t>
             </w:r>
           </w:p>
         </w:tc>
@@ -5828,19 +5875,11 @@
             <w:tcW w:type="dxa" w:w="4100"/>
           </w:tcPr>
           <w:p>
-            <w:pPr>
-              <w:spacing w:before="0" w:after="0" w:line="276" w:lineRule="auto"/>
-              <w:jc w:val="left"/>
-            </w:pPr>
             <w:r>
               <w:rPr>
                 <w:rFonts w:ascii="Microsoft YaHei" w:hAnsi="Microsoft YaHei" w:eastAsia="Microsoft YaHei"/>
-                <w:b w:val="0"/>
-                <w:i w:val="0"/>
-                <w:color w:val="14231D"/>
-                <w:sz w:val="18"/>
               </w:rPr>
-              <w:t>HTTP 路由、会话安全、测试结果</w:t>
+              <w:t>PR #1、负载矩阵、资源采样、故障恢复、账本审计与原始数据；3 分</w:t>
             </w:r>
           </w:p>
         </w:tc>
@@ -5864,7 +5903,7 @@
           <w:color w:val="14231D"/>
           <w:sz w:val="22"/>
         </w:rPr>
-        <w:t>正式成员贡献比例需由三名成员依据 Git 提交、设计评审、测试、部署值守、文档和答辩准备共同确认，不按代码行数机械分配。</w:t>
+        <w:t>组长按实际负责范围和可核验证据给出 10 分制贡献评分：魏子安 4 分、强璞 3 分、阳震 3 分。强璞负责标准 VC 互操作工作包，阳震负责性能基准与故障证据工作包；两人的原始作者信息分别保留在 PR #2 和 PR #1 中。</w:t>
       </w:r>
     </w:p>
     <w:p>
@@ -5927,7 +5966,7 @@
           <w:color w:val="14231D"/>
           <w:sz w:val="22"/>
         </w:rPr>
-        <w:t>有限披露是 bearer capability，不是 BBS+ 或零知识范围证明。</w:t>
+        <w:t>标准 VC 文件已实现 Ed25519 签名和签名/状态/锚定三段验证；有限披露仍是 bearer capability，不是 BBS+ 或零知识范围证明。</w:t>
       </w:r>
     </w:p>
     <w:p>
@@ -5945,7 +5984,7 @@
           <w:color w:val="14231D"/>
           <w:sz w:val="22"/>
         </w:rPr>
-        <w:t>尚未完成 Caliper 吞吐、P95/P99 延迟和并发失败率基准。</w:t>
+        <w:t>性能结论来自单机回环网络和共享宿主：7 类负载、4 档并发、每档 3 次，共 84 个正式单元，不能外推为跨校生产容量。</w:t>
       </w:r>
     </w:p>
     <w:p>
@@ -5988,7 +6027,7 @@
           <w:color w:val="14231D"/>
           <w:sz w:val="22"/>
         </w:rPr>
-        <w:t>ChainGrade 完成了课程要求的 Fabric 成绩存证与查询，并形成签发、复核、学生持有、外部验真、修订/申诉和有限披露闭环。项目最重要的结果不是把更多字段上链，而是用真实身份和状态机约束变更，用私有集合保护明文，用公共承诺支持核验，并用交易、测试、区块和恢复数据证明这些设计实际运行。</w:t>
+        <w:t>ChainGrade 完成了课程要求的 Fabric 成绩存证与查询，并形成签发、复核、学生持有、外部验真、修订/申诉、有限披露和标准 VC 文件互操作闭环。120 项项目测试和 7 项基准工具测试全部通过；84 个正式性能单元未记录合法请求失败，故障实验给出了 14.030–22.482 秒的稳定恢复时间。项目最重要的结果不是把更多字段上链，而是用真实身份和状态机约束变更，用私有集合保护明文，用公共承诺支持核验，并用交易、测试、区块和恢复数据证明这些设计实际运行。</w:t>
       </w:r>
     </w:p>
     <w:tbl>
@@ -6023,22 +6062,8 @@
             <w:r>
               <w:rPr>
                 <w:rFonts w:ascii="Microsoft YaHei" w:hAnsi="Microsoft YaHei" w:eastAsia="Microsoft YaHei"/>
-                <w:b/>
-                <w:i w:val="0"/>
-                <w:color w:val="0F513F"/>
-                <w:sz w:val="22"/>
               </w:rPr>
-              <w:t xml:space="preserve">下一阶段  </w:t>
-            </w:r>
-            <w:r>
-              <w:rPr>
-                <w:rFonts w:ascii="Microsoft YaHei" w:hAnsi="Microsoft YaHei" w:eastAsia="Microsoft YaHei"/>
-                <w:b w:val="0"/>
-                <w:i w:val="0"/>
-                <w:color w:val="14231D"/>
-                <w:sz w:val="22"/>
-              </w:rPr>
-              <w:t>在同一项目上补充可重复性能基准、标准 VC/BBS+ 技术尖峰和多 orderer 故障实验；不另建竞赛版产品。</w:t>
+              <w:t>下一阶段  标准 VC 文件互操作和可重复性能基准已经完成；后续只保留 BBS+/零知识阈值证明、三 orderer 高可用和真实教务接入，不另建竞赛版产品。</w:t>
             </w:r>
           </w:p>
         </w:tc>

</xml_diff>

<commit_message>
docs: finalize course submission materials
</commit_message>
<xml_diff>
--- a/deliverables/course/ChainGrade_项目介绍.docx
+++ b/deliverables/course/ChainGrade_项目介绍.docx
@@ -189,19 +189,11 @@
             <w:tcW w:type="dxa" w:w="7560"/>
           </w:tcPr>
           <w:p>
-            <w:pPr>
-              <w:spacing w:before="0" w:after="0" w:line="276" w:lineRule="auto"/>
-              <w:jc w:val="left"/>
-            </w:pPr>
             <w:r>
               <w:rPr>
-                <w:rFonts w:ascii="Microsoft YaHei" w:hAnsi="Microsoft YaHei" w:eastAsia="Microsoft YaHei"/>
-                <w:b w:val="0"/>
-                <w:i w:val="0"/>
-                <w:color w:val="14231D"/>
-                <w:sz w:val="18"/>
+                <w:rFonts w:eastAsia="Microsoft YaHei"/>
               </w:rPr>
-              <w:t>魏子安</w:t>
+              <w:t>魏子安（3240101782）</w:t>
             </w:r>
           </w:p>
         </w:tc>
@@ -235,19 +227,11 @@
             <w:shd w:fill="F3F6F2"/>
           </w:tcPr>
           <w:p>
-            <w:pPr>
-              <w:spacing w:before="0" w:after="0" w:line="276" w:lineRule="auto"/>
-              <w:jc w:val="left"/>
-            </w:pPr>
             <w:r>
               <w:rPr>
-                <w:rFonts w:ascii="Microsoft YaHei" w:hAnsi="Microsoft YaHei" w:eastAsia="Microsoft YaHei"/>
-                <w:b w:val="0"/>
-                <w:i w:val="0"/>
-                <w:color w:val="14231D"/>
-                <w:sz w:val="18"/>
+                <w:rFonts w:eastAsia="Microsoft YaHei"/>
               </w:rPr>
-              <w:t>强璞、阳震</w:t>
+              <w:t>强璞（3240102045）、阳震（3240105586）</w:t>
             </w:r>
           </w:p>
         </w:tc>
@@ -5740,19 +5724,13 @@
             <w:tcW w:type="dxa" w:w="1700"/>
           </w:tcPr>
           <w:p>
-            <w:pPr>
-              <w:spacing w:before="0" w:after="0" w:line="276" w:lineRule="auto"/>
-              <w:jc w:val="left"/>
-            </w:pPr>
             <w:r>
               <w:rPr>
-                <w:rFonts w:ascii="Microsoft YaHei" w:hAnsi="Microsoft YaHei" w:eastAsia="Microsoft YaHei"/>
-                <w:b w:val="0"/>
-                <w:i w:val="0"/>
-                <w:color w:val="14231D"/>
-                <w:sz w:val="18"/>
+                <w:rFonts w:eastAsia="Microsoft YaHei"/>
               </w:rPr>
               <w:t>魏子安</w:t>
+              <w:br/>
+              <w:t>3240101782</w:t>
             </w:r>
           </w:p>
         </w:tc>
@@ -5790,19 +5768,13 @@
             <w:shd w:fill="F3F6F2"/>
           </w:tcPr>
           <w:p>
-            <w:pPr>
-              <w:spacing w:before="0" w:after="0" w:line="276" w:lineRule="auto"/>
-              <w:jc w:val="left"/>
-            </w:pPr>
             <w:r>
               <w:rPr>
-                <w:rFonts w:ascii="Microsoft YaHei" w:hAnsi="Microsoft YaHei" w:eastAsia="Microsoft YaHei"/>
-                <w:b w:val="0"/>
-                <w:i w:val="0"/>
-                <w:color w:val="14231D"/>
-                <w:sz w:val="18"/>
+                <w:rFonts w:eastAsia="Microsoft YaHei"/>
               </w:rPr>
               <w:t>强璞</w:t>
+              <w:br/>
+              <w:t>3240102045</w:t>
             </w:r>
           </w:p>
         </w:tc>
@@ -5841,19 +5813,13 @@
             <w:tcW w:type="dxa" w:w="1700"/>
           </w:tcPr>
           <w:p>
-            <w:pPr>
-              <w:spacing w:before="0" w:after="0" w:line="276" w:lineRule="auto"/>
-              <w:jc w:val="left"/>
-            </w:pPr>
             <w:r>
               <w:rPr>
-                <w:rFonts w:ascii="Microsoft YaHei" w:hAnsi="Microsoft YaHei" w:eastAsia="Microsoft YaHei"/>
-                <w:b w:val="0"/>
-                <w:i w:val="0"/>
-                <w:color w:val="14231D"/>
-                <w:sz w:val="18"/>
+                <w:rFonts w:eastAsia="Microsoft YaHei"/>
               </w:rPr>
               <w:t>阳震</w:t>
+              <w:br/>
+              <w:t>3240105586</w:t>
             </w:r>
           </w:p>
         </w:tc>
@@ -5903,7 +5869,7 @@
           <w:color w:val="14231D"/>
           <w:sz w:val="22"/>
         </w:rPr>
-        <w:t>组长按实际负责范围和可核验证据给出 10 分制贡献评分：魏子安 4 分、强璞 3 分、阳震 3 分。强璞负责标准 VC 互操作工作包，阳震负责性能基准与故障证据工作包；两人的原始作者信息分别保留在 PR #2 和 PR #1 中。</w:t>
+        <w:t>组长按实际负责范围和可核验证据给出 10 分制贡献评分：魏子安（3240101782）4 分、强璞（3240102045）3 分、阳震（3240105586）3 分。强璞负责标准 VC 互操作工作包，阳震负责性能基准与故障证据工作包；两人的原始作者信息分别保留在 PR #2 和 PR #1 中。</w:t>
       </w:r>
     </w:p>
     <w:p>

</xml_diff>